<commit_message>
add user feedback after test
</commit_message>
<xml_diff>
--- a/Prototype 3/TestFile/Testing Plan for Interactive Prototype 3.docx
+++ b/Prototype 3/TestFile/Testing Plan for Interactive Prototype 3.docx
@@ -185,7 +185,7 @@
         <w:widowControl/>
         <w:spacing w:before="100" w:beforeAutospacing="1" w:after="100" w:afterAutospacing="1" w:line="360" w:lineRule="auto"/>
         <w:rPr>
-          <w:rFonts w:ascii="Times New Roman" w:eastAsia="宋体" w:hAnsi="Times New Roman" w:cs="Times New Roman" w:hint="eastAsia"/>
+          <w:rFonts w:ascii="Times New Roman" w:eastAsia="宋体" w:hAnsi="Times New Roman" w:cs="Times New Roman"/>
           <w:kern w:val="0"/>
           <w:sz w:val="24"/>
           <w14:ligatures w14:val="none"/>
@@ -646,25 +646,7 @@
           <w:sz w:val="24"/>
           <w14:ligatures w14:val="none"/>
         </w:rPr>
-        <w:t xml:space="preserve"> to switch to another </w:t>
-      </w:r>
-      <w:r>
-        <w:rPr>
-          <w:rFonts w:ascii="Times New Roman" w:eastAsia="宋体" w:hAnsi="Times New Roman" w:cs="Times New Roman"/>
-          <w:kern w:val="0"/>
-          <w:sz w:val="24"/>
-          <w14:ligatures w14:val="none"/>
-        </w:rPr>
-        <w:t>scene and</w:t>
-      </w:r>
-      <w:r>
-        <w:rPr>
-          <w:rFonts w:ascii="Times New Roman" w:eastAsia="宋体" w:hAnsi="Times New Roman" w:cs="Times New Roman"/>
-          <w:kern w:val="0"/>
-          <w:sz w:val="24"/>
-          <w14:ligatures w14:val="none"/>
-        </w:rPr>
-        <w:t xml:space="preserve"> push it back to return to the original.</w:t>
+        <w:t xml:space="preserve"> to switch to another scene and push it back to return to the original.</w:t>
       </w:r>
     </w:p>
     <w:p>
@@ -919,7 +901,6 @@
           <w:szCs w:val="36"/>
           <w14:ligatures w14:val="none"/>
         </w:rPr>
-        <w:lastRenderedPageBreak/>
         <w:t>4. Prototype Description</w:t>
       </w:r>
     </w:p>
@@ -941,6 +922,7 @@
           <w:sz w:val="24"/>
           <w14:ligatures w14:val="none"/>
         </w:rPr>
+        <w:lastRenderedPageBreak/>
         <w:t xml:space="preserve">The prototype is built in </w:t>
       </w:r>
       <w:r>
@@ -1452,7 +1434,6 @@
           <w:szCs w:val="36"/>
           <w14:ligatures w14:val="none"/>
         </w:rPr>
-        <w:lastRenderedPageBreak/>
         <w:t>6. Testing Setup</w:t>
       </w:r>
     </w:p>
@@ -1474,6 +1455,7 @@
           <w:sz w:val="24"/>
           <w14:ligatures w14:val="none"/>
         </w:rPr>
+        <w:lastRenderedPageBreak/>
         <w:t>Testing will be conducted in a safe, quiet environment suitable for VR movement. The setup includes:</w:t>
       </w:r>
     </w:p>
@@ -1868,6 +1850,247 @@
           <w14:ligatures w14:val="none"/>
         </w:rPr>
         <w:t>The test is expected to provide insight into how environmental and camera-based interactions influence immersion and usability. Feedback will help refine physics calibration, interaction feedback, and comfort balance in future iterations. Ultimately, the goal is to achieve more natural, controllable, and enjoyable physical interaction experiences within VR creative environments.</w:t>
+      </w:r>
+    </w:p>
+    <w:p>
+      <w:pPr>
+        <w:widowControl/>
+        <w:spacing w:before="100" w:beforeAutospacing="1" w:after="100" w:afterAutospacing="1" w:line="360" w:lineRule="auto"/>
+        <w:rPr>
+          <w:rFonts w:ascii="Times New Roman" w:eastAsia="宋体" w:hAnsi="Times New Roman" w:cs="Times New Roman"/>
+          <w:kern w:val="0"/>
+          <w:sz w:val="24"/>
+          <w14:ligatures w14:val="none"/>
+        </w:rPr>
+      </w:pPr>
+      <w:r>
+        <w:rPr>
+          <w:rFonts w:ascii="Times New Roman" w:eastAsia="宋体" w:hAnsi="Times New Roman" w:cs="Times New Roman"/>
+          <w:b/>
+          <w:bCs/>
+          <w:kern w:val="0"/>
+          <w:sz w:val="36"/>
+          <w:szCs w:val="36"/>
+          <w14:ligatures w14:val="none"/>
+        </w:rPr>
+        <w:t xml:space="preserve">9. </w:t>
+      </w:r>
+      <w:r>
+        <w:rPr>
+          <w:rFonts w:ascii="Times New Roman" w:eastAsia="宋体" w:hAnsi="Times New Roman" w:cs="Times New Roman"/>
+          <w:b/>
+          <w:bCs/>
+          <w:kern w:val="0"/>
+          <w:sz w:val="36"/>
+          <w:szCs w:val="36"/>
+          <w14:ligatures w14:val="none"/>
+        </w:rPr>
+        <w:t xml:space="preserve">Research Summary </w:t>
+      </w:r>
+    </w:p>
+    <w:p>
+      <w:pPr>
+        <w:widowControl/>
+        <w:spacing w:before="100" w:beforeAutospacing="1" w:after="100" w:afterAutospacing="1" w:line="360" w:lineRule="auto"/>
+        <w:rPr>
+          <w:rFonts w:ascii="Times New Roman" w:eastAsia="宋体" w:hAnsi="Times New Roman" w:cs="Times New Roman"/>
+          <w:kern w:val="0"/>
+          <w:sz w:val="24"/>
+          <w14:ligatures w14:val="none"/>
+        </w:rPr>
+      </w:pPr>
+      <w:r>
+        <w:rPr>
+          <w:rFonts w:ascii="Times New Roman" w:eastAsia="宋体" w:hAnsi="Times New Roman" w:cs="Times New Roman"/>
+          <w:kern w:val="0"/>
+          <w:sz w:val="24"/>
+          <w14:ligatures w14:val="none"/>
+        </w:rPr>
+        <w:lastRenderedPageBreak/>
+        <w:t>Realistic physical interactions play a vital role in improving user immersion, spatial awareness, and perceived control in virtual environments. Lee et al. [1] emphasize that multi-modal hand-based interactions such as pulling, rotating, and pushing levers enhance realism and engagement compared to purely gestural input. This finding supports the inclusion of lever-based scene switching in the current prototype. Rothe et al. [2] further demonstrate that camera height and dynamic viewpoint adjustment directly affect users’ sense of embodiment and comfort, validating the camera height control mechanism implemented through controller motion. Additionally, a comprehensive review of virtual reality interaction interfaces [3] outlines that physics-based mechanics—such as drawers, hinges, and levers—contribute to more intuitive and natural interactions by aligning virtual responses with users’ real-world expectations.</w:t>
+      </w:r>
+    </w:p>
+    <w:p>
+      <w:pPr>
+        <w:widowControl/>
+        <w:spacing w:before="100" w:beforeAutospacing="1" w:after="100" w:afterAutospacing="1" w:line="360" w:lineRule="auto"/>
+        <w:rPr>
+          <w:rFonts w:ascii="Times New Roman" w:eastAsia="宋体" w:hAnsi="Times New Roman" w:cs="Times New Roman"/>
+          <w:kern w:val="0"/>
+          <w:sz w:val="24"/>
+          <w14:ligatures w14:val="none"/>
+        </w:rPr>
+      </w:pPr>
+      <w:r>
+        <w:rPr>
+          <w:rFonts w:ascii="Times New Roman" w:eastAsia="宋体" w:hAnsi="Times New Roman" w:cs="Times New Roman"/>
+          <w:kern w:val="0"/>
+          <w:sz w:val="24"/>
+          <w14:ligatures w14:val="none"/>
+        </w:rPr>
+        <w:t>Building on these studies, this prototype integrates drawer, shutter-door, lever, and camera-height interactions to explore how physical affordances influence immersion, usability, and realism in an XR creative workspace. The design aims to evaluate how embodied, physics-driven interactions improve control precision, spatial awareness, and user satisfaction compared to previous gesture-based systems.</w:t>
+      </w:r>
+    </w:p>
+    <w:p>
+      <w:pPr>
+        <w:widowControl/>
+        <w:spacing w:before="100" w:beforeAutospacing="1" w:after="100" w:afterAutospacing="1" w:line="360" w:lineRule="auto"/>
+        <w:rPr>
+          <w:rFonts w:ascii="Times New Roman" w:eastAsia="宋体" w:hAnsi="Times New Roman" w:cs="Times New Roman"/>
+          <w:b/>
+          <w:bCs/>
+          <w:kern w:val="0"/>
+          <w:sz w:val="36"/>
+          <w:szCs w:val="36"/>
+          <w14:ligatures w14:val="none"/>
+        </w:rPr>
+      </w:pPr>
+      <w:r>
+        <w:rPr>
+          <w:rFonts w:ascii="Times New Roman" w:eastAsia="宋体" w:hAnsi="Times New Roman" w:cs="Times New Roman"/>
+          <w:b/>
+          <w:bCs/>
+          <w:kern w:val="0"/>
+          <w:sz w:val="36"/>
+          <w:szCs w:val="36"/>
+          <w14:ligatures w14:val="none"/>
+        </w:rPr>
+        <w:t xml:space="preserve">10. </w:t>
+      </w:r>
+      <w:r>
+        <w:rPr>
+          <w:rFonts w:ascii="Times New Roman" w:eastAsia="宋体" w:hAnsi="Times New Roman" w:cs="Times New Roman"/>
+          <w:b/>
+          <w:bCs/>
+          <w:kern w:val="0"/>
+          <w:sz w:val="36"/>
+          <w:szCs w:val="36"/>
+          <w14:ligatures w14:val="none"/>
+        </w:rPr>
+        <w:t xml:space="preserve">References </w:t>
+      </w:r>
+    </w:p>
+    <w:p>
+      <w:pPr>
+        <w:widowControl/>
+        <w:spacing w:before="100" w:beforeAutospacing="1" w:after="100" w:afterAutospacing="1" w:line="360" w:lineRule="auto"/>
+        <w:rPr>
+          <w:rFonts w:ascii="Times New Roman" w:eastAsia="宋体" w:hAnsi="Times New Roman" w:cs="Times New Roman"/>
+          <w:kern w:val="0"/>
+          <w:sz w:val="24"/>
+          <w14:ligatures w14:val="none"/>
+        </w:rPr>
+      </w:pPr>
+      <w:r>
+        <w:rPr>
+          <w:rFonts w:ascii="Times New Roman" w:eastAsia="宋体" w:hAnsi="Times New Roman" w:cs="Times New Roman"/>
+          <w:kern w:val="0"/>
+          <w:sz w:val="24"/>
+          <w14:ligatures w14:val="none"/>
+        </w:rPr>
+        <w:t xml:space="preserve">[1] H. Lee, A. </w:t>
+      </w:r>
+      <w:proofErr w:type="spellStart"/>
+      <w:r>
+        <w:rPr>
+          <w:rFonts w:ascii="Times New Roman" w:eastAsia="宋体" w:hAnsi="Times New Roman" w:cs="Times New Roman"/>
+          <w:kern w:val="0"/>
+          <w:sz w:val="24"/>
+          <w14:ligatures w14:val="none"/>
+        </w:rPr>
+        <w:t>Restoles</w:t>
+      </w:r>
+      <w:proofErr w:type="spellEnd"/>
+      <w:r>
+        <w:rPr>
+          <w:rFonts w:ascii="Times New Roman" w:eastAsia="宋体" w:hAnsi="Times New Roman" w:cs="Times New Roman"/>
+          <w:kern w:val="0"/>
+          <w:sz w:val="24"/>
+          <w14:ligatures w14:val="none"/>
+        </w:rPr>
+        <w:t>, and C. Vidal Jr., “A Virtual Reality Object Interaction System with Complex Hand Interactions,” in Lecture Notes in Networks and Systems, 2023, pp. 91–103. Springer.</w:t>
+      </w:r>
+    </w:p>
+    <w:p>
+      <w:pPr>
+        <w:widowControl/>
+        <w:spacing w:before="100" w:beforeAutospacing="1" w:after="100" w:afterAutospacing="1" w:line="360" w:lineRule="auto"/>
+        <w:rPr>
+          <w:rFonts w:ascii="Times New Roman" w:eastAsia="宋体" w:hAnsi="Times New Roman" w:cs="Times New Roman"/>
+          <w:kern w:val="0"/>
+          <w:sz w:val="24"/>
+          <w14:ligatures w14:val="none"/>
+        </w:rPr>
+      </w:pPr>
+      <w:r>
+        <w:rPr>
+          <w:rFonts w:ascii="Times New Roman" w:eastAsia="宋体" w:hAnsi="Times New Roman" w:cs="Times New Roman"/>
+          <w:kern w:val="0"/>
+          <w:sz w:val="24"/>
+          <w14:ligatures w14:val="none"/>
+        </w:rPr>
+        <w:t xml:space="preserve">[2] S. Rothe, M. Busch, L. Nagel, and M. E. </w:t>
+      </w:r>
+      <w:proofErr w:type="spellStart"/>
+      <w:r>
+        <w:rPr>
+          <w:rFonts w:ascii="Times New Roman" w:eastAsia="宋体" w:hAnsi="Times New Roman" w:cs="Times New Roman"/>
+          <w:kern w:val="0"/>
+          <w:sz w:val="24"/>
+          <w14:ligatures w14:val="none"/>
+        </w:rPr>
+        <w:t>Latoschik</w:t>
+      </w:r>
+      <w:proofErr w:type="spellEnd"/>
+      <w:r>
+        <w:rPr>
+          <w:rFonts w:ascii="Times New Roman" w:eastAsia="宋体" w:hAnsi="Times New Roman" w:cs="Times New Roman"/>
+          <w:kern w:val="0"/>
+          <w:sz w:val="24"/>
+          <w14:ligatures w14:val="none"/>
+        </w:rPr>
+        <w:t xml:space="preserve">, “The Impact of Camera Height in Cinematic Virtual Reality,” in Proc. 24th ACM </w:t>
+      </w:r>
+      <w:proofErr w:type="spellStart"/>
+      <w:r>
+        <w:rPr>
+          <w:rFonts w:ascii="Times New Roman" w:eastAsia="宋体" w:hAnsi="Times New Roman" w:cs="Times New Roman"/>
+          <w:kern w:val="0"/>
+          <w:sz w:val="24"/>
+          <w14:ligatures w14:val="none"/>
+        </w:rPr>
+        <w:t>Symp</w:t>
+      </w:r>
+      <w:proofErr w:type="spellEnd"/>
+      <w:r>
+        <w:rPr>
+          <w:rFonts w:ascii="Times New Roman" w:eastAsia="宋体" w:hAnsi="Times New Roman" w:cs="Times New Roman"/>
+          <w:kern w:val="0"/>
+          <w:sz w:val="24"/>
+          <w14:ligatures w14:val="none"/>
+        </w:rPr>
+        <w:t>. Virtual Reality Software and Technology (VRST), 2018.</w:t>
+      </w:r>
+    </w:p>
+    <w:p>
+      <w:pPr>
+        <w:widowControl/>
+        <w:spacing w:before="100" w:beforeAutospacing="1" w:after="100" w:afterAutospacing="1" w:line="360" w:lineRule="auto"/>
+        <w:rPr>
+          <w:rFonts w:ascii="Times New Roman" w:eastAsia="宋体" w:hAnsi="Times New Roman" w:cs="Times New Roman"/>
+          <w:kern w:val="0"/>
+          <w:sz w:val="24"/>
+          <w14:ligatures w14:val="none"/>
+        </w:rPr>
+      </w:pPr>
+      <w:r>
+        <w:rPr>
+          <w:rFonts w:ascii="Times New Roman" w:eastAsia="宋体" w:hAnsi="Times New Roman" w:cs="Times New Roman"/>
+          <w:kern w:val="0"/>
+          <w:sz w:val="24"/>
+          <w14:ligatures w14:val="none"/>
+        </w:rPr>
+        <w:t>[3] “A Survey on the Design of Virtual Reality Interaction Interfaces,” Sensors, vol. 24, no. 19, p. 6204, 2024.</w:t>
       </w:r>
     </w:p>
     <w:sectPr>

</xml_diff>